<commit_message>
T32: pin HF model revisions + doc hygiene
Pin all 5 study models to their exact TC1-cached commit hashes on all 10
config entries (configs/tc1.yaml + configs/tc1_512.yaml). Read authoritatively
from the snapshot dir names — the refs/main grep had clipped one char on both
Qwen hashes, caught before pinning. Rewrite report §5.7 and the Ch8 limitation
from "weights not commit-pinned" to pinned, mirrored into Appendix A's embedded
YAML so it stays a faithful copy of tc1_512.yaml. Changes no result: refs/main
pointed at exactly these snapshots, so the pins are what already loaded offline.

Also fold in prior doc hygiene: prune todo.md to live items (T1/T30/T3 +
key-rotation), regenerate HANDOFF.md from live state, fix the claim-ledger
check count (55 -> 58, post-D44).

Gates: config schema validates (10/10 pinned, 40-char), verify-claims 58/58,
pytest 339, agent-check 8/8, docx content-verified (6 checks).

Co-Authored-By: Claude Opus 4.8 <noreply@anthropic.com>
</commit_message>
<xml_diff>
--- a/docs/FYP_Report_2026-07-01_v5.docx
+++ b/docs/FYP_Report_2026-07-01_v5.docx
@@ -9772,7 +9772,7 @@
           <w:sz w:val="22"/>
           <w:szCs w:val="22"/>
         </w:rPr>
-        <w:t xml:space="preserve">All runs share the same global seed (42), deterministic dataset shuffling, and deterministic decoding. The exact commit hash of the framework at the time of the final result run will be recorded in the final report and will accompany the result tables. Per-prompt records are persisted to raw.jsonl with full metadata. Two reproducibility scopes are distinguished. The study can be re-executed from scratch from any repository checkout (configs, seeds, prompts, and pipeline are committed) — with one caveat: the configs do not pin a Hugging Face revision for the model weights, so a from-scratch re-execution fetches whatever revision is current at that date rather than the exact snapshots cached on TC1 at the recorded run dates (Chapter 8); and every reported number can be replayed from the committed analysis artifacts and redacted score sidecars. The raw per-prompt records themselves are local-only evidence — gitignored and hash-pinned in results/raw_artifact_manifest.sha256 — so recomputing the analysis directly from raw outputs requires the locally held evidence trees, not a fresh clone. One further provenance boundary: the run records carry the model alias, pair id, and quantized flag, but not the quantization method (NF4 versus INT8) or the resolved compute dtype as explicit fields; for the committed studies these are fixed by the study name and configuration, the loader guarantees the NF4 compute dtype equals the baseline's float16, and the pipeline persists both fields explicitly for future runs.</w:t>
+        <w:t xml:space="preserve">All runs share the same global seed (42), deterministic dataset shuffling, and deterministic decoding. The exact commit hash of the framework at the time of the final result run will be recorded in the final report and will accompany the result tables. Per-prompt records are persisted to raw.jsonl with full metadata. Two reproducibility scopes are distinguished. The study can be re-executed from scratch from any repository checkout (configs, seeds, prompts, and pipeline are committed): the five model repositories are pinned by Hugging Face commit hash — the revision field on every model entry in configs/tc1.yaml and configs/tc1_512.yaml, set to the exact snapshots used on TC1 — so an online re-execution loads byte-identical weights rather than whatever revision happens to be current at fetch time; and every reported number can be replayed from the committed analysis artifacts and redacted score sidecars. The raw per-prompt records themselves are local-only evidence — gitignored and hash-pinned in results/raw_artifact_manifest.sha256 — so recomputing the analysis directly from raw outputs requires the locally held evidence trees, not a fresh clone. One further provenance boundary: the run records carry the model alias, pair id, and quantized flag, but not the quantization method (NF4 versus INT8) or the resolved compute dtype as explicit fields; for the committed studies these are fixed by the study name and configuration, the loader guarantees the NF4 compute dtype equals the baseline's float16, and the pipeline persists both fields explicitly for future runs.</w:t>
       </w:r>
     </w:p>
     <w:p>
@@ -20160,7 +20160,7 @@
           <w:sz w:val="22"/>
           <w:szCs w:val="22"/>
         </w:rPr>
-        <w:t xml:space="preserve">Model weights not commit-pinned. The configuration schema exposes an optional revision field (a Hugging Face commit pin, Appendix C), but the study's configs load every model at the repository head current at fetch time. The weights actually used are those cached on TC1 at the recorded run dates; a from-scratch reproduction on a later date would re-fetch whatever revision is then current, which for a re-uploaded checkpoint need not be byte-identical. Within the study this does not affect any matched-pair delta (both members of every pair load the same cached snapshot), but exact external reproduction requires pinning the revisions of the five model repositories.</w:t>
+        <w:t xml:space="preserve">Model-weight provenance (pinned). Each of the five model repositories is pinned by Hugging Face commit hash — the optional revision field (Appendix C) set on every entry in configs/tc1.yaml and configs/tc1_512.yaml (Appendix A) — to the exact snapshot cached on TC1 at the recorded run dates, so an online from-scratch reproduction loads byte-identical weights rather than a possibly re-uploaded head. The residual reproducibility boundary is therefore not the weights but the raw per-prompt generations: those are retained locally (gitignored, hash-pinned in results/raw_artifact_manifest.sha256), so the analysis replays from the committed redacted sidecars but is not recomputable from raw generations on a fresh clone.</w:t>
       </w:r>
     </w:p>
     <w:p>
@@ -21113,7 +21113,7 @@
           <w:sz w:val="18"/>
           <w:szCs w:val="18"/>
         </w:rPr>
-        <w:t xml:space="preserve">    trust_remote_code: false</w:t>
+        <w:t xml:space="preserve">    revision: 70d244cc86ccca08cf5af4e1e306ecf908b1ad5e  # T32: TC1-cached snapshot pinned 2026-07-08</w:t>
       </w:r>
     </w:p>
     <w:p>
@@ -21127,7 +21127,7 @@
           <w:sz w:val="18"/>
           <w:szCs w:val="18"/>
         </w:rPr>
-        <w:t xml:space="preserve">    dtype: auto</w:t>
+        <w:t xml:space="preserve">    trust_remote_code: false</w:t>
       </w:r>
     </w:p>
     <w:p>
@@ -21141,7 +21141,7 @@
           <w:sz w:val="18"/>
           <w:szCs w:val="18"/>
         </w:rPr>
-        <w:t xml:space="preserve">    benchmarks: [harmbench, xstest, mmlu, arc]</w:t>
+        <w:t xml:space="preserve">    dtype: auto</w:t>
       </w:r>
     </w:p>
     <w:p>
@@ -21155,7 +21155,7 @@
           <w:sz w:val="18"/>
           <w:szCs w:val="18"/>
         </w:rPr>
-        <w:t xml:space="preserve"> </w:t>
+        <w:t xml:space="preserve">    benchmarks: [harmbench, xstest, mmlu, arc]</w:t>
       </w:r>
     </w:p>
     <w:p>
@@ -21169,7 +21169,7 @@
           <w:sz w:val="18"/>
           <w:szCs w:val="18"/>
         </w:rPr>
-        <w:t xml:space="preserve">  qwen_2b_4bit:</w:t>
+        <w:t xml:space="preserve"> </w:t>
       </w:r>
     </w:p>
     <w:p>
@@ -21183,7 +21183,7 @@
           <w:sz w:val="18"/>
           <w:szCs w:val="18"/>
         </w:rPr>
-        <w:t xml:space="preserve">    family: qwen</w:t>
+        <w:t xml:space="preserve">  qwen_2b_4bit:</w:t>
       </w:r>
     </w:p>
     <w:p>
@@ -21197,7 +21197,7 @@
           <w:sz w:val="18"/>
           <w:szCs w:val="18"/>
         </w:rPr>
-        <w:t xml:space="preserve">    size_b: 1.7</w:t>
+        <w:t xml:space="preserve">    family: qwen</w:t>
       </w:r>
     </w:p>
     <w:p>
@@ -21211,7 +21211,7 @@
           <w:sz w:val="18"/>
           <w:szCs w:val="18"/>
         </w:rPr>
-        <w:t xml:space="preserve">    quantized: true</w:t>
+        <w:t xml:space="preserve">    size_b: 1.7</w:t>
       </w:r>
     </w:p>
     <w:p>
@@ -21225,7 +21225,7 @@
           <w:sz w:val="18"/>
           <w:szCs w:val="18"/>
         </w:rPr>
-        <w:t xml:space="preserve">    pair_id: qwen_2b</w:t>
+        <w:t xml:space="preserve">    quantized: true</w:t>
       </w:r>
     </w:p>
     <w:p>
@@ -21239,7 +21239,7 @@
           <w:sz w:val="18"/>
           <w:szCs w:val="18"/>
         </w:rPr>
-        <w:t xml:space="preserve">    model_id: Qwen/Qwen3-1.7B</w:t>
+        <w:t xml:space="preserve">    pair_id: qwen_2b</w:t>
       </w:r>
     </w:p>
     <w:p>
@@ -21253,7 +21253,7 @@
           <w:sz w:val="18"/>
           <w:szCs w:val="18"/>
         </w:rPr>
-        <w:t xml:space="preserve">    trust_remote_code: false</w:t>
+        <w:t xml:space="preserve">    model_id: Qwen/Qwen3-1.7B</w:t>
       </w:r>
     </w:p>
     <w:p>
@@ -21267,7 +21267,7 @@
           <w:sz w:val="18"/>
           <w:szCs w:val="18"/>
         </w:rPr>
-        <w:t xml:space="preserve">    dtype: auto</w:t>
+        <w:t xml:space="preserve">    revision: 70d244cc86ccca08cf5af4e1e306ecf908b1ad5e  # T32: TC1-cached snapshot pinned 2026-07-08</w:t>
       </w:r>
     </w:p>
     <w:p>
@@ -21281,7 +21281,7 @@
           <w:sz w:val="18"/>
           <w:szCs w:val="18"/>
         </w:rPr>
-        <w:t xml:space="preserve">    benchmarks: [harmbench, xstest, mmlu, arc]</w:t>
+        <w:t xml:space="preserve">    trust_remote_code: false</w:t>
       </w:r>
     </w:p>
     <w:p>
@@ -21295,7 +21295,7 @@
           <w:sz w:val="18"/>
           <w:szCs w:val="18"/>
         </w:rPr>
-        <w:t xml:space="preserve"> </w:t>
+        <w:t xml:space="preserve">    dtype: auto</w:t>
       </w:r>
     </w:p>
     <w:p>
@@ -21309,7 +21309,7 @@
           <w:sz w:val="18"/>
           <w:szCs w:val="18"/>
         </w:rPr>
-        <w:t xml:space="preserve">  qwen_4b_base:</w:t>
+        <w:t xml:space="preserve">    benchmarks: [harmbench, xstest, mmlu, arc]</w:t>
       </w:r>
     </w:p>
     <w:p>
@@ -21323,7 +21323,7 @@
           <w:sz w:val="18"/>
           <w:szCs w:val="18"/>
         </w:rPr>
-        <w:t xml:space="preserve">    family: qwen</w:t>
+        <w:t xml:space="preserve"> </w:t>
       </w:r>
     </w:p>
     <w:p>
@@ -21337,7 +21337,7 @@
           <w:sz w:val="18"/>
           <w:szCs w:val="18"/>
         </w:rPr>
-        <w:t xml:space="preserve">    size_b: 4.0</w:t>
+        <w:t xml:space="preserve">  qwen_4b_base:</w:t>
       </w:r>
     </w:p>
     <w:p>
@@ -21351,7 +21351,7 @@
           <w:sz w:val="18"/>
           <w:szCs w:val="18"/>
         </w:rPr>
-        <w:t xml:space="preserve">    quantized: false</w:t>
+        <w:t xml:space="preserve">    family: qwen</w:t>
       </w:r>
     </w:p>
     <w:p>
@@ -21365,7 +21365,7 @@
           <w:sz w:val="18"/>
           <w:szCs w:val="18"/>
         </w:rPr>
-        <w:t xml:space="preserve">    pair_id: qwen_4b</w:t>
+        <w:t xml:space="preserve">    size_b: 4.0</w:t>
       </w:r>
     </w:p>
     <w:p>
@@ -21379,7 +21379,7 @@
           <w:sz w:val="18"/>
           <w:szCs w:val="18"/>
         </w:rPr>
-        <w:t xml:space="preserve">    model_id: Qwen/Qwen3-4B</w:t>
+        <w:t xml:space="preserve">    quantized: false</w:t>
       </w:r>
     </w:p>
     <w:p>
@@ -21393,7 +21393,7 @@
           <w:sz w:val="18"/>
           <w:szCs w:val="18"/>
         </w:rPr>
-        <w:t xml:space="preserve">    trust_remote_code: false</w:t>
+        <w:t xml:space="preserve">    pair_id: qwen_4b</w:t>
       </w:r>
     </w:p>
     <w:p>
@@ -21407,7 +21407,7 @@
           <w:sz w:val="18"/>
           <w:szCs w:val="18"/>
         </w:rPr>
-        <w:t xml:space="preserve">    dtype: auto</w:t>
+        <w:t xml:space="preserve">    model_id: Qwen/Qwen3-4B</w:t>
       </w:r>
     </w:p>
     <w:p>
@@ -21421,7 +21421,7 @@
           <w:sz w:val="18"/>
           <w:szCs w:val="18"/>
         </w:rPr>
-        <w:t xml:space="preserve">    benchmarks: [harmbench, xstest, mmlu, arc]</w:t>
+        <w:t xml:space="preserve">    revision: 1cfa9a7208912126459214e8b04321603b3df60c  # T32: TC1-cached snapshot pinned 2026-07-08</w:t>
       </w:r>
     </w:p>
     <w:p>
@@ -21435,7 +21435,7 @@
           <w:sz w:val="18"/>
           <w:szCs w:val="18"/>
         </w:rPr>
-        <w:t xml:space="preserve"> </w:t>
+        <w:t xml:space="preserve">    trust_remote_code: false</w:t>
       </w:r>
     </w:p>
     <w:p>
@@ -21449,7 +21449,7 @@
           <w:sz w:val="18"/>
           <w:szCs w:val="18"/>
         </w:rPr>
-        <w:t xml:space="preserve">  qwen_4b_4bit:</w:t>
+        <w:t xml:space="preserve">    dtype: auto</w:t>
       </w:r>
     </w:p>
     <w:p>
@@ -21463,7 +21463,7 @@
           <w:sz w:val="18"/>
           <w:szCs w:val="18"/>
         </w:rPr>
-        <w:t xml:space="preserve">    family: qwen</w:t>
+        <w:t xml:space="preserve">    benchmarks: [harmbench, xstest, mmlu, arc]</w:t>
       </w:r>
     </w:p>
     <w:p>
@@ -21477,7 +21477,7 @@
           <w:sz w:val="18"/>
           <w:szCs w:val="18"/>
         </w:rPr>
-        <w:t xml:space="preserve">    size_b: 4.0</w:t>
+        <w:t xml:space="preserve"> </w:t>
       </w:r>
     </w:p>
     <w:p>
@@ -21491,7 +21491,7 @@
           <w:sz w:val="18"/>
           <w:szCs w:val="18"/>
         </w:rPr>
-        <w:t xml:space="preserve">    quantized: true</w:t>
+        <w:t xml:space="preserve">  qwen_4b_4bit:</w:t>
       </w:r>
     </w:p>
     <w:p>
@@ -21505,7 +21505,7 @@
           <w:sz w:val="18"/>
           <w:szCs w:val="18"/>
         </w:rPr>
-        <w:t xml:space="preserve">    pair_id: qwen_4b</w:t>
+        <w:t xml:space="preserve">    family: qwen</w:t>
       </w:r>
     </w:p>
     <w:p>
@@ -21519,7 +21519,7 @@
           <w:sz w:val="18"/>
           <w:szCs w:val="18"/>
         </w:rPr>
-        <w:t xml:space="preserve">    model_id: Qwen/Qwen3-4B</w:t>
+        <w:t xml:space="preserve">    size_b: 4.0</w:t>
       </w:r>
     </w:p>
     <w:p>
@@ -21533,7 +21533,7 @@
           <w:sz w:val="18"/>
           <w:szCs w:val="18"/>
         </w:rPr>
-        <w:t xml:space="preserve">    trust_remote_code: false</w:t>
+        <w:t xml:space="preserve">    quantized: true</w:t>
       </w:r>
     </w:p>
     <w:p>
@@ -21547,7 +21547,7 @@
           <w:sz w:val="18"/>
           <w:szCs w:val="18"/>
         </w:rPr>
-        <w:t xml:space="preserve">    dtype: auto</w:t>
+        <w:t xml:space="preserve">    pair_id: qwen_4b</w:t>
       </w:r>
     </w:p>
     <w:p>
@@ -21561,7 +21561,7 @@
           <w:sz w:val="18"/>
           <w:szCs w:val="18"/>
         </w:rPr>
-        <w:t xml:space="preserve">    benchmarks: [harmbench, xstest, mmlu, arc]</w:t>
+        <w:t xml:space="preserve">    model_id: Qwen/Qwen3-4B</w:t>
       </w:r>
     </w:p>
     <w:p>
@@ -21575,7 +21575,7 @@
           <w:sz w:val="18"/>
           <w:szCs w:val="18"/>
         </w:rPr>
-        <w:t xml:space="preserve"> </w:t>
+        <w:t xml:space="preserve">    revision: 1cfa9a7208912126459214e8b04321603b3df60c  # T32: TC1-cached snapshot pinned 2026-07-08</w:t>
       </w:r>
     </w:p>
     <w:p>
@@ -21589,7 +21589,7 @@
           <w:sz w:val="18"/>
           <w:szCs w:val="18"/>
         </w:rPr>
-        <w:t xml:space="preserve">  llama_3_2_3b_base:</w:t>
+        <w:t xml:space="preserve">    trust_remote_code: false</w:t>
       </w:r>
     </w:p>
     <w:p>
@@ -21603,7 +21603,7 @@
           <w:sz w:val="18"/>
           <w:szCs w:val="18"/>
         </w:rPr>
-        <w:t xml:space="preserve">    family: llama</w:t>
+        <w:t xml:space="preserve">    dtype: auto</w:t>
       </w:r>
     </w:p>
     <w:p>
@@ -21617,7 +21617,7 @@
           <w:sz w:val="18"/>
           <w:szCs w:val="18"/>
         </w:rPr>
-        <w:t xml:space="preserve">    size_b: 3.0</w:t>
+        <w:t xml:space="preserve">    benchmarks: [harmbench, xstest, mmlu, arc]</w:t>
       </w:r>
     </w:p>
     <w:p>
@@ -21631,7 +21631,7 @@
           <w:sz w:val="18"/>
           <w:szCs w:val="18"/>
         </w:rPr>
-        <w:t xml:space="preserve">    quantized: false</w:t>
+        <w:t xml:space="preserve"> </w:t>
       </w:r>
     </w:p>
     <w:p>
@@ -21645,7 +21645,7 @@
           <w:sz w:val="18"/>
           <w:szCs w:val="18"/>
         </w:rPr>
-        <w:t xml:space="preserve">    pair_id: llama_3_2_3b</w:t>
+        <w:t xml:space="preserve">  llama_3_2_3b_base:</w:t>
       </w:r>
     </w:p>
     <w:p>
@@ -21659,7 +21659,7 @@
           <w:sz w:val="18"/>
           <w:szCs w:val="18"/>
         </w:rPr>
-        <w:t xml:space="preserve">    model_id: meta-llama/Llama-3.2-3B-Instruct</w:t>
+        <w:t xml:space="preserve">    family: llama</w:t>
       </w:r>
     </w:p>
     <w:p>
@@ -21673,7 +21673,7 @@
           <w:sz w:val="18"/>
           <w:szCs w:val="18"/>
         </w:rPr>
-        <w:t xml:space="preserve">    trust_remote_code: false</w:t>
+        <w:t xml:space="preserve">    size_b: 3.0</w:t>
       </w:r>
     </w:p>
     <w:p>
@@ -21687,7 +21687,7 @@
           <w:sz w:val="18"/>
           <w:szCs w:val="18"/>
         </w:rPr>
-        <w:t xml:space="preserve">    dtype: auto</w:t>
+        <w:t xml:space="preserve">    quantized: false</w:t>
       </w:r>
     </w:p>
     <w:p>
@@ -21701,7 +21701,7 @@
           <w:sz w:val="18"/>
           <w:szCs w:val="18"/>
         </w:rPr>
-        <w:t xml:space="preserve">    benchmarks: [harmbench, xstest, mmlu, arc]</w:t>
+        <w:t xml:space="preserve">    pair_id: llama_3_2_3b</w:t>
       </w:r>
     </w:p>
     <w:p>
@@ -21715,7 +21715,7 @@
           <w:sz w:val="18"/>
           <w:szCs w:val="18"/>
         </w:rPr>
-        <w:t xml:space="preserve"> </w:t>
+        <w:t xml:space="preserve">    model_id: meta-llama/Llama-3.2-3B-Instruct</w:t>
       </w:r>
     </w:p>
     <w:p>
@@ -21729,7 +21729,7 @@
           <w:sz w:val="18"/>
           <w:szCs w:val="18"/>
         </w:rPr>
-        <w:t xml:space="preserve">  llama_3_2_3b_4bit:</w:t>
+        <w:t xml:space="preserve">    revision: 0cb88a4f764b7a12671c53f0838cd831a0843b95  # T32: TC1-cached snapshot pinned 2026-07-08</w:t>
       </w:r>
     </w:p>
     <w:p>
@@ -21743,7 +21743,7 @@
           <w:sz w:val="18"/>
           <w:szCs w:val="18"/>
         </w:rPr>
-        <w:t xml:space="preserve">    family: llama</w:t>
+        <w:t xml:space="preserve">    trust_remote_code: false</w:t>
       </w:r>
     </w:p>
     <w:p>
@@ -21757,7 +21757,7 @@
           <w:sz w:val="18"/>
           <w:szCs w:val="18"/>
         </w:rPr>
-        <w:t xml:space="preserve">    size_b: 3.0</w:t>
+        <w:t xml:space="preserve">    dtype: auto</w:t>
       </w:r>
     </w:p>
     <w:p>
@@ -21771,7 +21771,7 @@
           <w:sz w:val="18"/>
           <w:szCs w:val="18"/>
         </w:rPr>
-        <w:t xml:space="preserve">    quantized: true</w:t>
+        <w:t xml:space="preserve">    benchmarks: [harmbench, xstest, mmlu, arc]</w:t>
       </w:r>
     </w:p>
     <w:p>
@@ -21785,7 +21785,7 @@
           <w:sz w:val="18"/>
           <w:szCs w:val="18"/>
         </w:rPr>
-        <w:t xml:space="preserve">    pair_id: llama_3_2_3b</w:t>
+        <w:t xml:space="preserve"> </w:t>
       </w:r>
     </w:p>
     <w:p>
@@ -21799,7 +21799,7 @@
           <w:sz w:val="18"/>
           <w:szCs w:val="18"/>
         </w:rPr>
-        <w:t xml:space="preserve">    model_id: meta-llama/Llama-3.2-3B-Instruct</w:t>
+        <w:t xml:space="preserve">  llama_3_2_3b_4bit:</w:t>
       </w:r>
     </w:p>
     <w:p>
@@ -21813,7 +21813,7 @@
           <w:sz w:val="18"/>
           <w:szCs w:val="18"/>
         </w:rPr>
-        <w:t xml:space="preserve">    trust_remote_code: false</w:t>
+        <w:t xml:space="preserve">    family: llama</w:t>
       </w:r>
     </w:p>
     <w:p>
@@ -21827,7 +21827,7 @@
           <w:sz w:val="18"/>
           <w:szCs w:val="18"/>
         </w:rPr>
-        <w:t xml:space="preserve">    dtype: auto</w:t>
+        <w:t xml:space="preserve">    size_b: 3.0</w:t>
       </w:r>
     </w:p>
     <w:p>
@@ -21841,7 +21841,7 @@
           <w:sz w:val="18"/>
           <w:szCs w:val="18"/>
         </w:rPr>
-        <w:t xml:space="preserve">    benchmarks: [harmbench, xstest, mmlu, arc]</w:t>
+        <w:t xml:space="preserve">    quantized: true</w:t>
       </w:r>
     </w:p>
     <w:p>
@@ -21855,7 +21855,7 @@
           <w:sz w:val="18"/>
           <w:szCs w:val="18"/>
         </w:rPr>
-        <w:t xml:space="preserve"> </w:t>
+        <w:t xml:space="preserve">    pair_id: llama_3_2_3b</w:t>
       </w:r>
     </w:p>
     <w:p>
@@ -21869,7 +21869,7 @@
           <w:sz w:val="18"/>
           <w:szCs w:val="18"/>
         </w:rPr>
-        <w:t xml:space="preserve">  # Cross-family extension (run on TC1 2026-06-15; results in Chapter 6, §6.13).</w:t>
+        <w:t xml:space="preserve">    model_id: meta-llama/Llama-3.2-3B-Instruct</w:t>
       </w:r>
     </w:p>
     <w:p>
@@ -21883,7 +21883,7 @@
           <w:sz w:val="18"/>
           <w:szCs w:val="18"/>
         </w:rPr>
-        <w:t xml:space="preserve">  # See Chapter 9. Phi-4-mini uses the eager attention backend (the V100 has no</w:t>
+        <w:t xml:space="preserve">    revision: 0cb88a4f764b7a12671c53f0838cd831a0843b95  # T32: TC1-cached snapshot pinned 2026-07-08</w:t>
       </w:r>
     </w:p>
     <w:p>
@@ -21897,7 +21897,7 @@
           <w:sz w:val="18"/>
           <w:szCs w:val="18"/>
         </w:rPr>
-        <w:t xml:space="preserve">  # flash-attention kernels) and loads via native transformers Phi3; Mistral drops straight in.</w:t>
+        <w:t xml:space="preserve">    trust_remote_code: false</w:t>
       </w:r>
     </w:p>
     <w:p>
@@ -21911,7 +21911,7 @@
           <w:sz w:val="18"/>
           <w:szCs w:val="18"/>
         </w:rPr>
-        <w:t xml:space="preserve">  mistral_7b_base:</w:t>
+        <w:t xml:space="preserve">    dtype: auto</w:t>
       </w:r>
     </w:p>
     <w:p>
@@ -21925,7 +21925,7 @@
           <w:sz w:val="18"/>
           <w:szCs w:val="18"/>
         </w:rPr>
-        <w:t xml:space="preserve">    family: mistral</w:t>
+        <w:t xml:space="preserve">    benchmarks: [harmbench, xstest, mmlu, arc]</w:t>
       </w:r>
     </w:p>
     <w:p>
@@ -21939,7 +21939,7 @@
           <w:sz w:val="18"/>
           <w:szCs w:val="18"/>
         </w:rPr>
-        <w:t xml:space="preserve">    size_b: 7.2</w:t>
+        <w:t xml:space="preserve"> </w:t>
       </w:r>
     </w:p>
     <w:p>
@@ -21953,7 +21953,7 @@
           <w:sz w:val="18"/>
           <w:szCs w:val="18"/>
         </w:rPr>
-        <w:t xml:space="preserve">    quantized: false</w:t>
+        <w:t xml:space="preserve">  # Cross-family extension (run on TC1 2026-06-15; results in Chapter 6, §6.13).</w:t>
       </w:r>
     </w:p>
     <w:p>
@@ -21967,7 +21967,7 @@
           <w:sz w:val="18"/>
           <w:szCs w:val="18"/>
         </w:rPr>
-        <w:t xml:space="preserve">    pair_id: mistral_7b</w:t>
+        <w:t xml:space="preserve">  # See Chapter 9. Phi-4-mini uses the eager attention backend (the V100 has no</w:t>
       </w:r>
     </w:p>
     <w:p>
@@ -21981,7 +21981,7 @@
           <w:sz w:val="18"/>
           <w:szCs w:val="18"/>
         </w:rPr>
-        <w:t xml:space="preserve">    model_id: mistralai/Mistral-7B-Instruct-v0.3</w:t>
+        <w:t xml:space="preserve">  # flash-attention kernels) and loads via native transformers Phi3; Mistral drops straight in.</w:t>
       </w:r>
     </w:p>
     <w:p>
@@ -21995,7 +21995,7 @@
           <w:sz w:val="18"/>
           <w:szCs w:val="18"/>
         </w:rPr>
-        <w:t xml:space="preserve">    trust_remote_code: false</w:t>
+        <w:t xml:space="preserve">  mistral_7b_base:</w:t>
       </w:r>
     </w:p>
     <w:p>
@@ -22009,7 +22009,7 @@
           <w:sz w:val="18"/>
           <w:szCs w:val="18"/>
         </w:rPr>
-        <w:t xml:space="preserve">    dtype: auto</w:t>
+        <w:t xml:space="preserve">    family: mistral</w:t>
       </w:r>
     </w:p>
     <w:p>
@@ -22023,7 +22023,7 @@
           <w:sz w:val="18"/>
           <w:szCs w:val="18"/>
         </w:rPr>
-        <w:t xml:space="preserve">    benchmarks: [harmbench, xstest, mmlu, arc]</w:t>
+        <w:t xml:space="preserve">    size_b: 7.2</w:t>
       </w:r>
     </w:p>
     <w:p>
@@ -22037,7 +22037,7 @@
           <w:sz w:val="18"/>
           <w:szCs w:val="18"/>
         </w:rPr>
-        <w:t xml:space="preserve"> </w:t>
+        <w:t xml:space="preserve">    quantized: false</w:t>
       </w:r>
     </w:p>
     <w:p>
@@ -22051,7 +22051,7 @@
           <w:sz w:val="18"/>
           <w:szCs w:val="18"/>
         </w:rPr>
-        <w:t xml:space="preserve">  mistral_7b_4bit:</w:t>
+        <w:t xml:space="preserve">    pair_id: mistral_7b</w:t>
       </w:r>
     </w:p>
     <w:p>
@@ -22065,7 +22065,7 @@
           <w:sz w:val="18"/>
           <w:szCs w:val="18"/>
         </w:rPr>
-        <w:t xml:space="preserve">    family: mistral</w:t>
+        <w:t xml:space="preserve">    model_id: mistralai/Mistral-7B-Instruct-v0.3</w:t>
       </w:r>
     </w:p>
     <w:p>
@@ -22079,7 +22079,7 @@
           <w:sz w:val="18"/>
           <w:szCs w:val="18"/>
         </w:rPr>
-        <w:t xml:space="preserve">    size_b: 7.2</w:t>
+        <w:t xml:space="preserve">    revision: c170c708c41dac9275d15a8fff4eca08d52bab71  # T32: TC1-cached snapshot pinned 2026-07-08</w:t>
       </w:r>
     </w:p>
     <w:p>
@@ -22093,7 +22093,7 @@
           <w:sz w:val="18"/>
           <w:szCs w:val="18"/>
         </w:rPr>
-        <w:t xml:space="preserve">    quantized: true</w:t>
+        <w:t xml:space="preserve">    trust_remote_code: false</w:t>
       </w:r>
     </w:p>
     <w:p>
@@ -22107,7 +22107,7 @@
           <w:sz w:val="18"/>
           <w:szCs w:val="18"/>
         </w:rPr>
-        <w:t xml:space="preserve">    pair_id: mistral_7b</w:t>
+        <w:t xml:space="preserve">    dtype: auto</w:t>
       </w:r>
     </w:p>
     <w:p>
@@ -22121,7 +22121,7 @@
           <w:sz w:val="18"/>
           <w:szCs w:val="18"/>
         </w:rPr>
-        <w:t xml:space="preserve">    model_id: mistralai/Mistral-7B-Instruct-v0.3</w:t>
+        <w:t xml:space="preserve">    benchmarks: [harmbench, xstest, mmlu, arc]</w:t>
       </w:r>
     </w:p>
     <w:p>
@@ -22135,7 +22135,7 @@
           <w:sz w:val="18"/>
           <w:szCs w:val="18"/>
         </w:rPr>
-        <w:t xml:space="preserve">    trust_remote_code: false</w:t>
+        <w:t xml:space="preserve"> </w:t>
       </w:r>
     </w:p>
     <w:p>
@@ -22149,7 +22149,7 @@
           <w:sz w:val="18"/>
           <w:szCs w:val="18"/>
         </w:rPr>
-        <w:t xml:space="preserve">    dtype: auto</w:t>
+        <w:t xml:space="preserve">  mistral_7b_4bit:</w:t>
       </w:r>
     </w:p>
     <w:p>
@@ -22163,7 +22163,7 @@
           <w:sz w:val="18"/>
           <w:szCs w:val="18"/>
         </w:rPr>
-        <w:t xml:space="preserve">    benchmarks: [harmbench, xstest, mmlu, arc]</w:t>
+        <w:t xml:space="preserve">    family: mistral</w:t>
       </w:r>
     </w:p>
     <w:p>
@@ -22177,7 +22177,7 @@
           <w:sz w:val="18"/>
           <w:szCs w:val="18"/>
         </w:rPr>
-        <w:t xml:space="preserve"> </w:t>
+        <w:t xml:space="preserve">    size_b: 7.2</w:t>
       </w:r>
     </w:p>
     <w:p>
@@ -22191,7 +22191,7 @@
           <w:sz w:val="18"/>
           <w:szCs w:val="18"/>
         </w:rPr>
-        <w:t xml:space="preserve">  phi4_mini_base:</w:t>
+        <w:t xml:space="preserve">    quantized: true</w:t>
       </w:r>
     </w:p>
     <w:p>
@@ -22205,7 +22205,7 @@
           <w:sz w:val="18"/>
           <w:szCs w:val="18"/>
         </w:rPr>
-        <w:t xml:space="preserve">    family: phi</w:t>
+        <w:t xml:space="preserve">    pair_id: mistral_7b</w:t>
       </w:r>
     </w:p>
     <w:p>
@@ -22219,7 +22219,7 @@
           <w:sz w:val="18"/>
           <w:szCs w:val="18"/>
         </w:rPr>
-        <w:t xml:space="preserve">    size_b: 3.8</w:t>
+        <w:t xml:space="preserve">    model_id: mistralai/Mistral-7B-Instruct-v0.3</w:t>
       </w:r>
     </w:p>
     <w:p>
@@ -22233,7 +22233,7 @@
           <w:sz w:val="18"/>
           <w:szCs w:val="18"/>
         </w:rPr>
-        <w:t xml:space="preserve">    quantized: false</w:t>
+        <w:t xml:space="preserve">    revision: c170c708c41dac9275d15a8fff4eca08d52bab71  # T32: TC1-cached snapshot pinned 2026-07-08</w:t>
       </w:r>
     </w:p>
     <w:p>
@@ -22247,7 +22247,7 @@
           <w:sz w:val="18"/>
           <w:szCs w:val="18"/>
         </w:rPr>
-        <w:t xml:space="preserve">    pair_id: phi4_mini</w:t>
+        <w:t xml:space="preserve">    trust_remote_code: false</w:t>
       </w:r>
     </w:p>
     <w:p>
@@ -22261,7 +22261,7 @@
           <w:sz w:val="18"/>
           <w:szCs w:val="18"/>
         </w:rPr>
-        <w:t xml:space="preserve">    model_id: microsoft/Phi-4-mini-instruct</w:t>
+        <w:t xml:space="preserve">    dtype: auto</w:t>
       </w:r>
     </w:p>
     <w:p>
@@ -22275,7 +22275,7 @@
           <w:sz w:val="18"/>
           <w:szCs w:val="18"/>
         </w:rPr>
-        <w:t xml:space="preserve">    trust_remote_code: false</w:t>
+        <w:t xml:space="preserve">    benchmarks: [harmbench, xstest, mmlu, arc]</w:t>
       </w:r>
     </w:p>
     <w:p>
@@ -22289,7 +22289,7 @@
           <w:sz w:val="18"/>
           <w:szCs w:val="18"/>
         </w:rPr>
-        <w:t xml:space="preserve">    attn_implementation: eager</w:t>
+        <w:t xml:space="preserve"> </w:t>
       </w:r>
     </w:p>
     <w:p>
@@ -22303,7 +22303,7 @@
           <w:sz w:val="18"/>
           <w:szCs w:val="18"/>
         </w:rPr>
-        <w:t xml:space="preserve">    dtype: auto</w:t>
+        <w:t xml:space="preserve">  phi4_mini_base:</w:t>
       </w:r>
     </w:p>
     <w:p>
@@ -22317,7 +22317,7 @@
           <w:sz w:val="18"/>
           <w:szCs w:val="18"/>
         </w:rPr>
-        <w:t xml:space="preserve">    benchmarks: [harmbench, xstest, mmlu, arc]</w:t>
+        <w:t xml:space="preserve">    family: phi</w:t>
       </w:r>
     </w:p>
     <w:p>
@@ -22331,7 +22331,7 @@
           <w:sz w:val="18"/>
           <w:szCs w:val="18"/>
         </w:rPr>
-        <w:t xml:space="preserve"> </w:t>
+        <w:t xml:space="preserve">    size_b: 3.8</w:t>
       </w:r>
     </w:p>
     <w:p>
@@ -22345,7 +22345,7 @@
           <w:sz w:val="18"/>
           <w:szCs w:val="18"/>
         </w:rPr>
-        <w:t xml:space="preserve">  phi4_mini_4bit:</w:t>
+        <w:t xml:space="preserve">    quantized: false</w:t>
       </w:r>
     </w:p>
     <w:p>
@@ -22359,7 +22359,7 @@
           <w:sz w:val="18"/>
           <w:szCs w:val="18"/>
         </w:rPr>
-        <w:t xml:space="preserve">    family: phi</w:t>
+        <w:t xml:space="preserve">    pair_id: phi4_mini</w:t>
       </w:r>
     </w:p>
     <w:p>
@@ -22373,7 +22373,7 @@
           <w:sz w:val="18"/>
           <w:szCs w:val="18"/>
         </w:rPr>
-        <w:t xml:space="preserve">    size_b: 3.8</w:t>
+        <w:t xml:space="preserve">    model_id: microsoft/Phi-4-mini-instruct</w:t>
       </w:r>
     </w:p>
     <w:p>
@@ -22387,7 +22387,7 @@
           <w:sz w:val="18"/>
           <w:szCs w:val="18"/>
         </w:rPr>
-        <w:t xml:space="preserve">    quantized: true</w:t>
+        <w:t xml:space="preserve">    revision: cfbefacb99257ffa30c83adab238a50856ac3083  # T32: TC1-cached snapshot pinned 2026-07-08</w:t>
       </w:r>
     </w:p>
     <w:p>
@@ -22401,7 +22401,7 @@
           <w:sz w:val="18"/>
           <w:szCs w:val="18"/>
         </w:rPr>
-        <w:t xml:space="preserve">    pair_id: phi4_mini</w:t>
+        <w:t xml:space="preserve">    trust_remote_code: false</w:t>
       </w:r>
     </w:p>
     <w:p>
@@ -22415,7 +22415,147 @@
           <w:sz w:val="18"/>
           <w:szCs w:val="18"/>
         </w:rPr>
+        <w:t xml:space="preserve">    attn_implementation: eager</w:t>
+      </w:r>
+    </w:p>
+    <w:p>
+      <w:pPr>
+        <w:shd w:fill="F2F2F2" w:color="auto" w:val="clear"/>
+        <w:spacing w:after="0" w:line="240"/>
+      </w:pPr>
+      <w:r>
+        <w:rPr>
+          <w:rFonts w:ascii="Consolas" w:cs="Consolas" w:eastAsia="Consolas" w:hAnsi="Consolas"/>
+          <w:sz w:val="18"/>
+          <w:szCs w:val="18"/>
+        </w:rPr>
+        <w:t xml:space="preserve">    dtype: auto</w:t>
+      </w:r>
+    </w:p>
+    <w:p>
+      <w:pPr>
+        <w:shd w:fill="F2F2F2" w:color="auto" w:val="clear"/>
+        <w:spacing w:after="0" w:line="240"/>
+      </w:pPr>
+      <w:r>
+        <w:rPr>
+          <w:rFonts w:ascii="Consolas" w:cs="Consolas" w:eastAsia="Consolas" w:hAnsi="Consolas"/>
+          <w:sz w:val="18"/>
+          <w:szCs w:val="18"/>
+        </w:rPr>
+        <w:t xml:space="preserve">    benchmarks: [harmbench, xstest, mmlu, arc]</w:t>
+      </w:r>
+    </w:p>
+    <w:p>
+      <w:pPr>
+        <w:shd w:fill="F2F2F2" w:color="auto" w:val="clear"/>
+        <w:spacing w:after="0" w:line="240"/>
+      </w:pPr>
+      <w:r>
+        <w:rPr>
+          <w:rFonts w:ascii="Consolas" w:cs="Consolas" w:eastAsia="Consolas" w:hAnsi="Consolas"/>
+          <w:sz w:val="18"/>
+          <w:szCs w:val="18"/>
+        </w:rPr>
+        <w:t xml:space="preserve"> </w:t>
+      </w:r>
+    </w:p>
+    <w:p>
+      <w:pPr>
+        <w:shd w:fill="F2F2F2" w:color="auto" w:val="clear"/>
+        <w:spacing w:after="0" w:line="240"/>
+      </w:pPr>
+      <w:r>
+        <w:rPr>
+          <w:rFonts w:ascii="Consolas" w:cs="Consolas" w:eastAsia="Consolas" w:hAnsi="Consolas"/>
+          <w:sz w:val="18"/>
+          <w:szCs w:val="18"/>
+        </w:rPr>
+        <w:t xml:space="preserve">  phi4_mini_4bit:</w:t>
+      </w:r>
+    </w:p>
+    <w:p>
+      <w:pPr>
+        <w:shd w:fill="F2F2F2" w:color="auto" w:val="clear"/>
+        <w:spacing w:after="0" w:line="240"/>
+      </w:pPr>
+      <w:r>
+        <w:rPr>
+          <w:rFonts w:ascii="Consolas" w:cs="Consolas" w:eastAsia="Consolas" w:hAnsi="Consolas"/>
+          <w:sz w:val="18"/>
+          <w:szCs w:val="18"/>
+        </w:rPr>
+        <w:t xml:space="preserve">    family: phi</w:t>
+      </w:r>
+    </w:p>
+    <w:p>
+      <w:pPr>
+        <w:shd w:fill="F2F2F2" w:color="auto" w:val="clear"/>
+        <w:spacing w:after="0" w:line="240"/>
+      </w:pPr>
+      <w:r>
+        <w:rPr>
+          <w:rFonts w:ascii="Consolas" w:cs="Consolas" w:eastAsia="Consolas" w:hAnsi="Consolas"/>
+          <w:sz w:val="18"/>
+          <w:szCs w:val="18"/>
+        </w:rPr>
+        <w:t xml:space="preserve">    size_b: 3.8</w:t>
+      </w:r>
+    </w:p>
+    <w:p>
+      <w:pPr>
+        <w:shd w:fill="F2F2F2" w:color="auto" w:val="clear"/>
+        <w:spacing w:after="0" w:line="240"/>
+      </w:pPr>
+      <w:r>
+        <w:rPr>
+          <w:rFonts w:ascii="Consolas" w:cs="Consolas" w:eastAsia="Consolas" w:hAnsi="Consolas"/>
+          <w:sz w:val="18"/>
+          <w:szCs w:val="18"/>
+        </w:rPr>
+        <w:t xml:space="preserve">    quantized: true</w:t>
+      </w:r>
+    </w:p>
+    <w:p>
+      <w:pPr>
+        <w:shd w:fill="F2F2F2" w:color="auto" w:val="clear"/>
+        <w:spacing w:after="0" w:line="240"/>
+      </w:pPr>
+      <w:r>
+        <w:rPr>
+          <w:rFonts w:ascii="Consolas" w:cs="Consolas" w:eastAsia="Consolas" w:hAnsi="Consolas"/>
+          <w:sz w:val="18"/>
+          <w:szCs w:val="18"/>
+        </w:rPr>
+        <w:t xml:space="preserve">    pair_id: phi4_mini</w:t>
+      </w:r>
+    </w:p>
+    <w:p>
+      <w:pPr>
+        <w:shd w:fill="F2F2F2" w:color="auto" w:val="clear"/>
+        <w:spacing w:after="0" w:line="240"/>
+      </w:pPr>
+      <w:r>
+        <w:rPr>
+          <w:rFonts w:ascii="Consolas" w:cs="Consolas" w:eastAsia="Consolas" w:hAnsi="Consolas"/>
+          <w:sz w:val="18"/>
+          <w:szCs w:val="18"/>
+        </w:rPr>
         <w:t xml:space="preserve">    model_id: microsoft/Phi-4-mini-instruct</w:t>
+      </w:r>
+    </w:p>
+    <w:p>
+      <w:pPr>
+        <w:shd w:fill="F2F2F2" w:color="auto" w:val="clear"/>
+        <w:spacing w:after="0" w:line="240"/>
+      </w:pPr>
+      <w:r>
+        <w:rPr>
+          <w:rFonts w:ascii="Consolas" w:cs="Consolas" w:eastAsia="Consolas" w:hAnsi="Consolas"/>
+          <w:sz w:val="18"/>
+          <w:szCs w:val="18"/>
+        </w:rPr>
+        <w:t xml:space="preserve">    revision: cfbefacb99257ffa30c83adab238a50856ac3083  # T32: TC1-cached snapshot pinned 2026-07-08</w:t>
       </w:r>
     </w:p>
     <w:p>

</xml_diff>